<commit_message>
Corrige le formulaire de contact, remplace le CV et enrichit les documents
- Corrige un bug bloquant la saisie (espace, flèches) dans les champs du
  formulaire de contact : la navigation clavier au clavier des slides
  n'ignorait pas les champs de saisie actifs
- Remplace le CV FR/EN par le nouveau CV "Consultant Junior Marketing
  Digital" fourni, même structure et cohérence visuelle dans les deux
  langues, toujours sur une page (+ versions docx éditables)
- Ajoute le logo Lemonway et un bandeau BNP Paribas en tête des
  documents téléchargeables correspondants (FR + EN)
- Redessine le schéma du parcours (À propos) : icônes par étape,
  dégradé de couleur, halo pulsant sur "IA & Agents" pour refléter un
  apprentissage en cours plutôt qu'une simple perspective future
</commit_message>
<xml_diff>
--- a/Audit_Parcours_BNP_Paribas.docx
+++ b/Audit_Parcours_BNP_Paribas.docx
@@ -2,6 +2,21 @@
 <file path=word/document.xml><?xml version="1.0" encoding="utf-8"?>
 <w:document xmlns:wpc="http://schemas.microsoft.com/office/word/2010/wordprocessingCanvas" xmlns:mc="http://schemas.openxmlformats.org/markup-compatibility/2006" xmlns:o="urn:schemas-microsoft-com:office:office" xmlns:r="http://schemas.openxmlformats.org/officeDocument/2006/relationships" xmlns:m="http://schemas.openxmlformats.org/officeDocument/2006/math" xmlns:v="urn:schemas-microsoft-com:vml" xmlns:wp14="http://schemas.microsoft.com/office/word/2010/wordprocessingDrawing" xmlns:wp="http://schemas.openxmlformats.org/drawingml/2006/wordprocessingDrawing" xmlns:w10="urn:schemas-microsoft-com:office:word" xmlns:w="http://schemas.openxmlformats.org/wordprocessingml/2006/main" xmlns:w14="http://schemas.microsoft.com/office/word/2010/wordml" xmlns:w15="http://schemas.microsoft.com/office/word/2012/wordml" xmlns:wpg="http://schemas.microsoft.com/office/word/2010/wordprocessingGroup" xmlns:wpi="http://schemas.microsoft.com/office/word/2010/wordprocessingInk" xmlns:wne="http://schemas.microsoft.com/office/word/2006/wordml" xmlns:wps="http://schemas.microsoft.com/office/word/2010/wordprocessingShape" xmlns:cx="http://schemas.microsoft.com/office/drawing/2014/chartex" xmlns:cx1="http://schemas.microsoft.com/office/drawing/2015/9/8/chartex" xmlns:cx2="http://schemas.microsoft.com/office/drawing/2015/10/21/chartex" xmlns:cx3="http://schemas.microsoft.com/office/drawing/2016/5/9/chartex" xmlns:cx4="http://schemas.microsoft.com/office/drawing/2016/5/10/chartex" xmlns:cx5="http://schemas.microsoft.com/office/drawing/2016/5/11/chartex" xmlns:cx6="http://schemas.microsoft.com/office/drawing/2016/5/12/chartex" xmlns:cx7="http://schemas.microsoft.com/office/drawing/2016/5/13/chartex" xmlns:cx8="http://schemas.microsoft.com/office/drawing/2016/5/14/chartex" xmlns:aink="http://schemas.microsoft.com/office/drawing/2016/ink" xmlns:am3d="http://schemas.microsoft.com/office/drawing/2017/model3d" xmlns:w16cex="http://schemas.microsoft.com/office/word/2018/wordml/cex" xmlns:w16cid="http://schemas.microsoft.com/office/word/2016/wordml/cid" xmlns:w16="http://schemas.microsoft.com/office/word/2018/wordml" xmlns:w16sdtdh="http://schemas.microsoft.com/office/word/2020/wordml/sdtdatahash" xmlns:w16se="http://schemas.microsoft.com/office/word/2015/wordml/symex" mc:Ignorable="w14 w15 wp14">
   <w:body>
+    <w:p>
+      <w:pPr>
+        <w:spacing w:after="40"/>
+        <w:jc w:val="left"/>
+      </w:pPr>
+      <w:r>
+        <w:rPr>
+          <w:rFonts w:ascii="Georgia" w:hAnsi="Georgia"/>
+          <w:b/>
+          <w:color w:val="12283F"/>
+          <w:sz w:val="30"/>
+        </w:rPr>
+        <w:t>BNP PARIBAS</w:t>
+      </w:r>
+    </w:p>
     <w:p>
       <w:pPr>
         <w:spacing w:after="40"/>

</xml_diff>